<commit_message>
docs(admin-guide): photo-complaint script + leads bot 24h SLA
Photo complaints: check the form choice first; consent given → point
to T&C acceptance + written prospective opt-out; no consent → apologize
and escalate, don't argue. New section 11: all leads land in the admin
Telegram bot, must be processed within 24h, tap Responded after reply.

Co-Authored-By: Claude Fable 5 <noreply@anthropic.com>
Claude-Session: https://claude.ai/code/session_018JV8wqCaTZ1b2x6di4P5Lh
</commit_message>
<xml_diff>
--- a/docs/admin-operations-guide.docx
+++ b/docs/admin-operations-guide.docx
@@ -552,6 +552,112 @@
       <w:r>
         <w:rPr/>
         <w:t xml:space="preserve">•  The full Terms &amp; Conditions are linked in the registration form; share the link with parents on request.</w:t>
+      </w:r>
+    </w:p>
+    <w:p>
+      <w:pPr>
+        <w:spacing w:before="0" w:after="60"/>
+      </w:pPr>
+      <w:r>
+        <w:t xml:space="preserve">•  </w:t>
+      </w:r>
+      <w:r>
+        <w:rPr>
+          <w:b/>
+        </w:rPr>
+        <w:t xml:space="preserve">If a parent complains about photos/videos: </w:t>
+      </w:r>
+      <w:r>
+        <w:t xml:space="preserve">first check their choice in the registration form. If they GAVE consent — calmly explain that photo/video use was accepted in our Terms &amp; Conditions at registration, and that they may withdraw consent at any time in writing (it applies going forward, not to already published materials).</w:t>
+      </w:r>
+    </w:p>
+    <w:p>
+      <w:pPr>
+        <w:spacing w:before="0" w:after="60"/>
+      </w:pPr>
+      <w:r>
+        <w:t xml:space="preserve">•  </w:t>
+      </w:r>
+      <w:r>
+        <w:rPr>
+          <w:b/>
+        </w:rPr>
+        <w:t xml:space="preserve">If the form shows NO consent and the child appeared in marketing — </w:t>
+      </w:r>
+      <w:r>
+        <w:t xml:space="preserve">apologize, escalate to management the same day, and make sure the child is excluded going forward. Do not argue in this case.</w:t>
+      </w:r>
+    </w:p>
+    <w:p>
+      <w:pPr>
+        <w:spacing w:before="0" w:after="60"/>
+      </w:pPr>
+      <w:r>
+        <w:t xml:space="preserve">•  Stay polite and never argue publicly — unresolved disputes go to management.</w:t>
+      </w:r>
+    </w:p>
+    <w:p>
+      <w:pPr>
+        <w:spacing w:before="220" w:after="100"/>
+      </w:pPr>
+      <w:r>
+        <w:rPr>
+          <w:b/>
+          <w:sz w:val="24"/>
+          <w:szCs w:val="24"/>
+          <w:color w:val="28347F"/>
+        </w:rPr>
+        <w:t xml:space="preserve">11. New leads — Telegram bot (24-hour rule)</w:t>
+      </w:r>
+    </w:p>
+    <w:p>
+      <w:pPr>
+        <w:spacing w:before="0" w:after="60"/>
+      </w:pPr>
+      <w:r>
+        <w:t xml:space="preserve">•  </w:t>
+      </w:r>
+      <w:r>
+        <w:rPr>
+          <w:b/>
+        </w:rPr>
+        <w:t xml:space="preserve">All new leads arrive in our admin Telegram bot (AcroGym Assistant) </w:t>
+      </w:r>
+      <w:r>
+        <w:t xml:space="preserve">as a card: parent name, phone, child age and a ready-to-send draft message.</w:t>
+      </w:r>
+    </w:p>
+    <w:p>
+      <w:pPr>
+        <w:spacing w:before="0" w:after="60"/>
+      </w:pPr>
+      <w:r>
+        <w:t xml:space="preserve">•  </w:t>
+      </w:r>
+      <w:r>
+        <w:rPr>
+          <w:b/>
+        </w:rPr>
+        <w:t xml:space="preserve">You must process every lead within 24 hours: </w:t>
+      </w:r>
+      <w:r>
+        <w:t xml:space="preserve">open the WhatsApp chat from the card, send the (edited) draft from your own account, then tap “✅ Responded” on the card.</w:t>
+      </w:r>
+    </w:p>
+    <w:p>
+      <w:pPr>
+        <w:spacing w:before="0" w:after="60"/>
+      </w:pPr>
+      <w:r>
+        <w:t xml:space="preserve">•  The bot reminds you about unanswered leads; after 48 hours it escalates — do not let it get there.</w:t>
+      </w:r>
+    </w:p>
+    <w:p>
+      <w:pPr>
+        <w:spacing w:before="0" w:after="60"/>
+      </w:pPr>
+      <w:r>
+        <w:t xml:space="preserve">•  Always tap “✅ Responded” after replying — otherwise reminders keep coming and reports show the lead as unanswered.</w:t>
       </w:r>
     </w:p>
     <w:p>

</xml_diff>

<commit_message>
docs(admin-guide): close 7 gaps found on double-check vs T&C
Paid first class (never 'free trial'), refund-request script (escalate,
don't argue), pricing questions -> management only, belongings & child
damage (T&C section 9 was missing entirely), same-day incident notes,
apply earned extension weeks at renewal, message opt-out handling.

Co-Authored-By: Claude Fable 5 <noreply@anthropic.com>
Claude-Session: https://claude.ai/code/session_018JV8wqCaTZ1b2x6di4P5Lh
</commit_message>
<xml_diff>
--- a/docs/admin-operations-guide.docx
+++ b/docs/admin-operations-guide.docx
@@ -178,6 +178,23 @@
         <w:spacing w:before="0" w:after="60"/>
       </w:pPr>
       <w:r>
+        <w:t xml:space="preserve">•  </w:t>
+      </w:r>
+      <w:r>
+        <w:rPr>
+          <w:b/>
+        </w:rPr>
+        <w:t xml:space="preserve">The first class is PAID — never say “free trial”. </w:t>
+      </w:r>
+      <w:r>
+        <w:t xml:space="preserve">The correct wording is “Book Your First Class”.</w:t>
+      </w:r>
+    </w:p>
+    <w:p>
+      <w:pPr>
+        <w:spacing w:before="0" w:after="60"/>
+      </w:pPr>
+      <w:r>
         <w:rPr/>
         <w:t xml:space="preserve">•  Always in advance: monthly, or per term (three terms per year).</w:t>
       </w:r>
@@ -247,6 +264,40 @@
         <w:spacing w:before="0" w:after="60"/>
       </w:pPr>
       <w:r>
+        <w:t xml:space="preserve">•  </w:t>
+      </w:r>
+      <w:r>
+        <w:rPr>
+          <w:b/>
+        </w:rPr>
+        <w:t xml:space="preserve">Refund requests: </w:t>
+      </w:r>
+      <w:r>
+        <w:t xml:space="preserve">fees are non-refundable under our Terms. Never promise a refund and never argue — reply “I’ll pass this to management” and escalate the same day.</w:t>
+      </w:r>
+    </w:p>
+    <w:p>
+      <w:pPr>
+        <w:spacing w:before="0" w:after="60"/>
+      </w:pPr>
+      <w:r>
+        <w:t xml:space="preserve">•  </w:t>
+      </w:r>
+      <w:r>
+        <w:rPr>
+          <w:b/>
+        </w:rPr>
+        <w:t xml:space="preserve">Discounts, pro-rated fees for mid-month joins, special deals — </w:t>
+      </w:r>
+      <w:r>
+        <w:t xml:space="preserve">management only. Do not quote or invent prices and exceptions yourself.</w:t>
+      </w:r>
+    </w:p>
+    <w:p>
+      <w:pPr>
+        <w:spacing w:before="0" w:after="60"/>
+      </w:pPr>
+      <w:r>
         <w:rPr/>
         <w:t xml:space="preserve">•  Price changes apply only from the next paid period, with prior notice to parents.</w:t>
       </w:r>
@@ -321,6 +372,23 @@
         <w:spacing w:before="0" w:after="60"/>
       </w:pPr>
       <w:r>
+        <w:t xml:space="preserve">•  </w:t>
+      </w:r>
+      <w:r>
+        <w:rPr>
+          <w:b/>
+        </w:rPr>
+        <w:t xml:space="preserve">Apply the earned extension at the next payment: </w:t>
+      </w:r>
+      <w:r>
+        <w:t xml:space="preserve">when confirming a renewal, check the child’s recorded absences and extend the period accordingly (max 1 week/month or 2 weeks/term). A promised week that isn’t applied is a broken promise.</w:t>
+      </w:r>
+    </w:p>
+    <w:p>
+      <w:pPr>
+        <w:spacing w:before="0" w:after="60"/>
+      </w:pPr>
+      <w:r>
         <w:rPr/>
         <w:t xml:space="preserve">•  If ACROGYM cancels a class: offer a make-up class or a credit. Our cancellations never reduce the paid classes.</w:t>
       </w:r>
@@ -426,6 +494,45 @@
           <w:szCs w:val="24"/>
           <w:color w:val="28347F"/>
         </w:rPr>
+        <w:t xml:space="preserve">7a. Personal belongings and property</w:t>
+      </w:r>
+    </w:p>
+    <w:p>
+      <w:pPr>
+        <w:spacing w:before="0" w:after="60"/>
+      </w:pPr>
+      <w:r>
+        <w:t xml:space="preserve">•  Ask families not to bring valuables — AcroGym is not responsible for lost, stolen or damaged personal items.</w:t>
+      </w:r>
+    </w:p>
+    <w:p>
+      <w:pPr>
+        <w:spacing w:before="0" w:after="60"/>
+      </w:pPr>
+      <w:r>
+        <w:t xml:space="preserve">•  </w:t>
+      </w:r>
+      <w:r>
+        <w:rPr>
+          <w:b/>
+        </w:rPr>
+        <w:t xml:space="preserve">Damage caused by a child </w:t>
+      </w:r>
+      <w:r>
+        <w:t xml:space="preserve">to equipment or venue property is the guardian’s responsibility (per the Terms). Record what happened and inform management — do not negotiate compensation yourself.</w:t>
+      </w:r>
+    </w:p>
+    <w:p>
+      <w:pPr>
+        <w:spacing w:before="220" w:after="100"/>
+      </w:pPr>
+      <w:r>
+        <w:rPr>
+          <w:b/>
+          <w:sz w:val="24"/>
+          <w:szCs w:val="24"/>
+          <w:color w:val="28347F"/>
+        </w:rPr>
         <w:t xml:space="preserve">8. Photos and video</w:t>
       </w:r>
     </w:p>
@@ -524,6 +631,45 @@
           <w:szCs w:val="24"/>
           <w:color w:val="28347F"/>
         </w:rPr>
+        <w:t xml:space="preserve">9a. Incidents — always write it down</w:t>
+      </w:r>
+    </w:p>
+    <w:p>
+      <w:pPr>
+        <w:spacing w:before="0" w:after="60"/>
+      </w:pPr>
+      <w:r>
+        <w:t xml:space="preserve">•  </w:t>
+      </w:r>
+      <w:r>
+        <w:rPr>
+          <w:b/>
+        </w:rPr>
+        <w:t xml:space="preserve">Any injury, first aid, conflict with a parent, or safety violation: </w:t>
+      </w:r>
+      <w:r>
+        <w:t xml:space="preserve">write a short incident note the SAME day — what happened, when, who was involved, what was done — and send it to management.</w:t>
+      </w:r>
+    </w:p>
+    <w:p>
+      <w:pPr>
+        <w:spacing w:before="0" w:after="60"/>
+      </w:pPr>
+      <w:r>
+        <w:t xml:space="preserve">•  An unrecorded incident does not exist when it matters. This protects the child, you, and AcroGym.</w:t>
+      </w:r>
+    </w:p>
+    <w:p>
+      <w:pPr>
+        <w:spacing w:before="220" w:after="100"/>
+      </w:pPr>
+      <w:r>
+        <w:rPr>
+          <w:b/>
+          <w:sz w:val="24"/>
+          <w:szCs w:val="24"/>
+          <w:color w:val="28347F"/>
+        </w:rPr>
         <w:t xml:space="preserve">10. Data and communication</w:t>
       </w:r>
     </w:p>
@@ -543,6 +689,23 @@
       <w:r>
         <w:rPr/>
         <w:t xml:space="preserve">•  Keep all client data confidential. Data access/correction/deletion requests → forward to info@acrogym.org.</w:t>
+      </w:r>
+    </w:p>
+    <w:p>
+      <w:pPr>
+        <w:spacing w:before="0" w:after="60"/>
+      </w:pPr>
+      <w:r>
+        <w:t xml:space="preserve">•  </w:t>
+      </w:r>
+      <w:r>
+        <w:rPr>
+          <w:b/>
+        </w:rPr>
+        <w:t xml:space="preserve">If a parent asks to stop receiving messages — </w:t>
+      </w:r>
+      <w:r>
+        <w:t xml:space="preserve">record it and never message them again (operational messages about their own child’s classes are still fine). This protects our WhatsApp number.</w:t>
       </w:r>
     </w:p>
     <w:p>

</xml_diff>

<commit_message>
docs(admin-guide): official price list (QAR)
First class 100; single class 250; monthly plan 125/class; term plan
105/class. Admins quote only these; discounts/exceptions stay
management-only (bullet reworded to remove the contradiction).

Co-Authored-By: Claude Fable 5 <noreply@anthropic.com>
Claude-Session: https://claude.ai/code/session_018JV8wqCaTZ1b2x6di4P5Lh
</commit_message>
<xml_diff>
--- a/docs/admin-operations-guide.docx
+++ b/docs/admin-operations-guide.docx
@@ -184,7 +184,7 @@
         <w:rPr>
           <w:b/>
         </w:rPr>
-        <w:t xml:space="preserve">The first class is PAID — never say “free trial”. </w:t>
+        <w:t xml:space="preserve">The first class is PAID — 100 QAR. Never say “free trial”. </w:t>
       </w:r>
       <w:r>
         <w:t xml:space="preserve">The correct wording is “Book Your First Class”.</w:t>
@@ -195,6 +195,23 @@
         <w:spacing w:before="0" w:after="60"/>
       </w:pPr>
       <w:r>
+        <w:t xml:space="preserve">•  </w:t>
+      </w:r>
+      <w:r>
+        <w:rPr>
+          <w:b/>
+        </w:rPr>
+        <w:t xml:space="preserve">Official prices (QAR): </w:t>
+      </w:r>
+      <w:r>
+        <w:t xml:space="preserve">first class — 100; single class (pay-per-class) — 250; monthly plan — 125 per class; term plan — 105 per class. The longer the commitment, the better the price — always mention the term option.</w:t>
+      </w:r>
+    </w:p>
+    <w:p>
+      <w:pPr>
+        <w:spacing w:before="0" w:after="60"/>
+      </w:pPr>
+      <w:r>
         <w:rPr/>
         <w:t xml:space="preserve">•  Always in advance: monthly, or per term (three terms per year).</w:t>
       </w:r>
@@ -290,7 +307,7 @@
         <w:t xml:space="preserve">Discounts, pro-rated fees for mid-month joins, special deals — </w:t>
       </w:r>
       <w:r>
-        <w:t xml:space="preserve">management only. Do not quote or invent prices and exceptions yourself.</w:t>
+        <w:t xml:space="preserve">management only. Quote ONLY the official prices above — never invent discounts or exceptions yourself.</w:t>
       </w:r>
     </w:p>
     <w:p>

</xml_diff>

<commit_message>
docs(admin-guide): sibling discount — 3rd child 15% off
Co-Authored-By: Claude Fable 5 <noreply@anthropic.com>
Claude-Session: https://claude.ai/code/session_018JV8wqCaTZ1b2x6di4P5Lh
</commit_message>
<xml_diff>
--- a/docs/admin-operations-guide.docx
+++ b/docs/admin-operations-guide.docx
@@ -205,6 +205,23 @@
       </w:r>
       <w:r>
         <w:t xml:space="preserve">first class — 100; single class — 250. Monthly plan (per month): 550 (1×/week), 1,100 (2×/week), 1,650 (3×/week). Term plan (per term): 1,500 / 3,000 / 4,500 for Terms 1–2; Term 3 (15 weeks): 1,600 / 3,200 / 4,800. Personal training: one child — 300, two children — 400 (per session). Term is our most popular and best-value option — always mention it. Full table: see the Season 2026/27 Price List.</w:t>
+      </w:r>
+    </w:p>
+    <w:p>
+      <w:pPr>
+        <w:spacing w:before="0" w:after="60"/>
+      </w:pPr>
+      <w:r>
+        <w:t xml:space="preserve">•  </w:t>
+      </w:r>
+      <w:r>
+        <w:rPr>
+          <w:b/>
+        </w:rPr>
+        <w:t xml:space="preserve">Sibling discount: </w:t>
+      </w:r>
+      <w:r>
+        <w:t xml:space="preserve">when one family enrolls three children, the THIRD child gets 15% off their plan. This is the only standing discount — anything else is management-only.</w:t>
       </w:r>
     </w:p>
     <w:p>

</xml_diff>